<commit_message>
Mt 20.1-16: citações bíblicas na NAA no sermão e no esboço de púlpito
Todas as citações conferidas na NAA (bibliaonline.com.br). Mt 20.15b e
Pv 22.9 ficam ao pé da letra, com aviso no púlpito e nota de rodapé. Gn
15.1 na NAA não sustenta sozinho 'a recompensa é ele mesmo': entra o Sl
73.25-26. 1Sm 30: Davi 'já ungido rei, mas ainda sem trono'. Horas de
20.5 e 27.45 religadas pela redação da NAA. DOCX regerados.

Co-Authored-By: Claude Opus 5.5 <noreply@anthropic.com>
Claude-Session: https://claude.ai/code/session_01KQBNEWywzDtypjXvMaZ1z8
</commit_message>
<xml_diff>
--- a/estudos/mateus/20-1-16-pulpito.docx
+++ b/estudos/mateus/20-1-16-pulpito.docx
@@ -1320,7 +1320,7 @@
           <w:sz w:val="23"/>
           <w:szCs w:val="23"/>
         </w:rPr>
-        <w:t xml:space="preserve">Que me quereis dar, e eu vo-lo entregarei?</w:t>
+        <w:t xml:space="preserve">Quanto me darão para que eu o entregue a vocês?</w:t>
       </w:r>
       <w:r>
         <w:rPr>
@@ -1391,7 +1391,7 @@
           <w:sz w:val="23"/>
           <w:szCs w:val="23"/>
         </w:rPr>
-        <w:t xml:space="preserve">depois: "lembra-te de mim quando vieres no teu Reino" → "hoje estarás comigo no paraíso" (Lc 23.42-43).</w:t>
+        <w:t xml:space="preserve">depois: "Jesus, lembre-se de mim quando você vier no seu Reino" → "hoje você estará comigo no paraíso" (Lc 23.42-43).</w:t>
       </w:r>
     </w:p>
     <w:p>
@@ -1504,7 +1504,7 @@
           <w:sz w:val="23"/>
           <w:szCs w:val="23"/>
         </w:rPr>
-        <w:t xml:space="preserve">Pedro: "nós tudo deixamos e te seguimos; que, pois, teremos?" (19.27);</w:t>
+        <w:t xml:space="preserve">Pedro: "Eis que nós deixamos tudo e seguimos o senhor; que será, pois, de nós?" (19.27);</w:t>
       </w:r>
     </w:p>
     <w:p>
@@ -1544,7 +1544,7 @@
           <w:sz w:val="23"/>
           <w:szCs w:val="23"/>
         </w:rPr>
-        <w:t xml:space="preserve">a parábola termina com outra pergunta: "</w:t>
+        <w:t xml:space="preserve">a parábola termina com outra pergunta, ao pé da letra: "</w:t>
       </w:r>
       <w:r>
         <w:rPr>
@@ -1669,7 +1669,7 @@
           <w:sz w:val="23"/>
           <w:szCs w:val="23"/>
         </w:rPr>
-        <w:t xml:space="preserve"> afastadas pelos discípulos, gente sem currículo, os "últimos": "dos tais é o reino dos céus" (19.13-15). Os religiosos faziam fila por mérito; Jesus abre a porta para quem não tem nada a apresentar;</w:t>
+        <w:t xml:space="preserve"> afastadas pelos discípulos, gente sem currículo, os "últimos": "dos tais é o Reino dos Céus" (19.13-15). Os religiosos faziam fila por mérito; Jesus abre a porta para quem não tem nada a apresentar;</w:t>
       </w:r>
     </w:p>
     <w:p>
@@ -1700,7 +1700,7 @@
           <w:sz w:val="23"/>
           <w:szCs w:val="23"/>
         </w:rPr>
-        <w:t xml:space="preserve"> "que farei eu de </w:t>
+        <w:t xml:space="preserve"> "que farei de </w:t>
       </w:r>
       <w:r>
         <w:rPr>
@@ -1864,7 +1864,7 @@
           <w:sz w:val="23"/>
           <w:szCs w:val="23"/>
         </w:rPr>
-        <w:t xml:space="preserve">9h: "o que for justo";</w:t>
+        <w:t xml:space="preserve">9h: "eu lhes pagarei o que for justo" (v. 4);</w:t>
       </w:r>
     </w:p>
     <w:p>
@@ -2262,7 +2262,7 @@
           <w:sz w:val="23"/>
           <w:szCs w:val="23"/>
         </w:rPr>
-        <w:t xml:space="preserve"> você também estava na praça. "Que tens tu que não tenhas recebido?" (1Co 4.7). Ser chamado já é recompensa. Você tinha esquecido?</w:t>
+        <w:t xml:space="preserve"> você também estava na praça. "E o que é que você tem que não tenha recebido?" (1Co 4.7). Ser chamado já é recompensa. Você tinha esquecido?</w:t>
       </w:r>
     </w:p>
     <w:p>
@@ -3231,7 +3231,7 @@
           <w:sz w:val="23"/>
           <w:szCs w:val="23"/>
         </w:rPr>
-        <w:t xml:space="preserve">v. 11 — "murmuravam":</w:t>
+        <w:t xml:space="preserve">v. 11 — "começaram a murmurar contra o dono das terras":</w:t>
       </w:r>
       <w:r>
         <w:rPr>
@@ -3282,7 +3282,7 @@
           <w:sz w:val="23"/>
           <w:szCs w:val="23"/>
         </w:rPr>
-        <w:t xml:space="preserve">v. 12 — "tu os fizeste iguais a nós":</w:t>
+        <w:t xml:space="preserve">v. 12 — "você os igualou a nós":</w:t>
       </w:r>
     </w:p>
     <w:p>
@@ -3322,7 +3322,7 @@
           <w:sz w:val="23"/>
           <w:szCs w:val="23"/>
         </w:rPr>
-        <w:t xml:space="preserve">não é "tu nos fizeste iguais a eles"; o foco está no que o outro recebeu;</w:t>
+        <w:t xml:space="preserve">não é "você nos igualou a eles"; o foco está no que o outro recebeu;</w:t>
       </w:r>
     </w:p>
     <w:p>
@@ -3505,7 +3505,7 @@
           <w:sz w:val="23"/>
           <w:szCs w:val="23"/>
         </w:rPr>
-        <w:t xml:space="preserve"> "Amigo, não te faço injustiça; não combinaste comigo um denário?" Ninguém foi lesado.</w:t>
+        <w:t xml:space="preserve"> "Amigo, não estou sendo injusto com você. Você não combinou comigo trabalhar por um denário?" Ninguém foi lesado.</w:t>
       </w:r>
     </w:p>
     <w:p>
@@ -3778,7 +3778,7 @@
           <w:sz w:val="23"/>
           <w:szCs w:val="23"/>
         </w:rPr>
-        <w:t xml:space="preserve"> "quero dar... Não me é lícito fazer o que quero com o que é meu?"</w:t>
+        <w:t xml:space="preserve"> "Pegue o que é seu e saia daqui. Pois quero dar... Será que não me é lícito fazer o que quero com o que é meu?"</w:t>
       </w:r>
     </w:p>
     <w:p>
@@ -3880,7 +3880,7 @@
           <w:sz w:val="23"/>
           <w:szCs w:val="23"/>
         </w:rPr>
-        <w:t xml:space="preserve">Diagnóstico (v. 15b):</w:t>
+        <w:t xml:space="preserve">Diagnóstico (v. 15b), em tradução literal:</w:t>
       </w:r>
       <w:r>
         <w:rPr>
@@ -3929,6 +3929,26 @@
           <w:sz w:val="23"/>
           <w:szCs w:val="23"/>
         </w:rPr>
+        <w:t xml:space="preserve">Avisar: a NAA lida traduz pelo sentido ("Ou você ficou com inveja porque eu sou bom?"); está certa, mas Jesus falou com uma imagem, e a imagem importa;</w:t>
+      </w:r>
+    </w:p>
+    <w:p>
+      <w:pPr>
+        <w:pStyle w:val="ListParagraph"/>
+        <w:numPr>
+          <w:ilvl w:val="1"/>
+          <w:numId w:val="2"/>
+        </w:numPr>
+        <w:spacing w:after="70" w:before="0" w:line="288" w:lineRule="auto"/>
+        <w:jc w:val="left"/>
+      </w:pPr>
+      <w:r>
+        <w:rPr>
+          <w:rFonts w:ascii="Cambria" w:cs="Cambria" w:eastAsia="Cambria" w:hAnsi="Cambria"/>
+          <w:color w:val="2B2B33"/>
+          <w:sz w:val="23"/>
+          <w:szCs w:val="23"/>
+        </w:rPr>
         <w:t xml:space="preserve">"Bom" volta de 19.17: o dono diz quem ele é;</w:t>
       </w:r>
     </w:p>
@@ -3949,7 +3969,7 @@
           <w:sz w:val="23"/>
           <w:szCs w:val="23"/>
         </w:rPr>
-        <w:t xml:space="preserve">"olho mau" = inveja, mesquinharia. Pv 22.9: "o de olhos bons... dá do seu pão ao pobre". O jovem rico não deu; o dono deu a quem ninguém contratou. Os primeiros descobrem em si o olho do homem que não quis deixar nada;</w:t>
+        <w:t xml:space="preserve">"olho mau" = inveja, mesquinharia. Pv 22.9: "O generoso será abençoado, porque reparte o seu pão com os pobres" (em hebraico, "o generoso" é "o de olho bom": o de olho bom reparte). O jovem rico não deu; o dono deu a quem ninguém contratou. Os primeiros descobrem em si o olho do homem que não quis deixar nada;</w:t>
       </w:r>
     </w:p>
     <w:p>
@@ -4161,7 +4181,7 @@
           <w:sz w:val="23"/>
           <w:szCs w:val="23"/>
         </w:rPr>
-        <w:t xml:space="preserve"> "de </w:t>
+        <w:t xml:space="preserve"> "De </w:t>
       </w:r>
       <w:r>
         <w:rPr>
@@ -4181,7 +4201,27 @@
           <w:sz w:val="23"/>
           <w:szCs w:val="23"/>
         </w:rPr>
-        <w:t xml:space="preserve"> árvore comerás livremente" (Gn 2.16) → "não comereis de toda árvore?" (Gn 3.1). A serpente pinta a generosidade de mesquinhez. Olhar para a bondade de Deus e chamar de injustiça: "Deus não é bom de verdade".</w:t>
+        <w:t xml:space="preserve"> árvore do jardim você pode comer livremente" (Gn 2.16) → "Não comam do fruto de </w:t>
+      </w:r>
+      <w:r>
+        <w:rPr>
+          <w:rFonts w:ascii="Cambria" w:cs="Cambria" w:eastAsia="Cambria" w:hAnsi="Cambria"/>
+          <w:b/>
+          <w:bCs/>
+          <w:color w:val="2B2B33"/>
+          <w:sz w:val="23"/>
+          <w:szCs w:val="23"/>
+        </w:rPr>
+        <w:t xml:space="preserve">nenhuma</w:t>
+      </w:r>
+      <w:r>
+        <w:rPr>
+          <w:rFonts w:ascii="Cambria" w:cs="Cambria" w:eastAsia="Cambria" w:hAnsi="Cambria"/>
+          <w:color w:val="2B2B33"/>
+          <w:sz w:val="23"/>
+          <w:szCs w:val="23"/>
+        </w:rPr>
+        <w:t xml:space="preserve"> árvore do jardim" (Gn 3.1). A serpente pinta a generosidade de mesquinhez. Olhar para a bondade de Deus e chamar de injustiça: "Deus não é bom de verdade".</w:t>
       </w:r>
     </w:p>
     <w:p>
@@ -4254,7 +4294,7 @@
           <w:sz w:val="23"/>
           <w:szCs w:val="23"/>
         </w:rPr>
-        <w:t xml:space="preserve">Que queres?</w:t>
+        <w:t xml:space="preserve">O que você quer?</w:t>
       </w:r>
       <w:r>
         <w:rPr>
@@ -4812,7 +4852,7 @@
           <w:sz w:val="23"/>
           <w:szCs w:val="23"/>
         </w:rPr>
-        <w:t xml:space="preserve">"Do que é meu" (v. 15):</w:t>
+        <w:t xml:space="preserve">"Com o que é meu" (v. 15):</w:t>
       </w:r>
       <w:r>
         <w:rPr>
@@ -4852,7 +4892,7 @@
           <w:sz w:val="23"/>
           <w:szCs w:val="23"/>
         </w:rPr>
-        <w:t xml:space="preserve"> entregue, condenado, escarnecido, açoitado, crucificado. </w:t>
+        <w:t xml:space="preserve"> entregue, condenado, zombado, açoitado, crucificado. </w:t>
       </w:r>
       <w:r>
         <w:rPr>
@@ -4923,7 +4963,7 @@
           <w:sz w:val="23"/>
           <w:szCs w:val="23"/>
         </w:rPr>
-        <w:t xml:space="preserve"> "justo e justificador". A graça não significa que Deus deixou de ser justo; em Cristo, pecadores recebem misericórdia sem que a justiça seja comprometida.</w:t>
+        <w:t xml:space="preserve"> "justo e o justificador". A graça não significa que Deus deixou de ser justo; em Cristo, pecadores recebem misericórdia sem que a justiça seja comprometida.</w:t>
       </w:r>
     </w:p>
     <w:p>
@@ -4985,7 +5025,7 @@
           <w:sz w:val="23"/>
           <w:szCs w:val="23"/>
         </w:rPr>
-        <w:t xml:space="preserve"> "desde a hora sexta até a hora nona, houve trevas" (27.45). Ali ele suportou o calor do juízo que era nosso. A parábola não é código das horas da cruz, mas a cruz mostra quem aguentou o peso do dia.</w:t>
+        <w:t xml:space="preserve"> "perto do meio-dia e às três horas da tarde" (20.5) → "A partir do meio-dia, houve trevas [...] até as três horas da tarde" (27.45). Ali ele suportou o calor do juízo que era nosso. A parábola não é código das horas da cruz, mas a cruz mostra quem aguentou o peso do dia.</w:t>
       </w:r>
     </w:p>
     <w:tbl>
@@ -5086,7 +5126,7 @@
           <w:sz w:val="23"/>
           <w:szCs w:val="23"/>
         </w:rPr>
-        <w:t xml:space="preserve"> "Aquele que não conheceu pecado, ele o fez pecado por nós; para que, nele, fôssemos feitos justiça de Deus." Gente da undécima hora recebendo o salário de quem trabalhou de sol a sol.</w:t>
+        <w:t xml:space="preserve"> "Aquele que não conheceu pecado, Deus o fez pecado por nós, para que, nele, fôssemos feitos justiça de Deus." Gente da undécima hora recebendo o salário de quem trabalhou de sol a sol.</w:t>
       </w:r>
     </w:p>
     <w:p>
@@ -5137,27 +5177,27 @@
           <w:sz w:val="23"/>
           <w:szCs w:val="23"/>
         </w:rPr>
-        <w:t xml:space="preserve">: 200 exaustos com a bagagem; os "maus e filhos de Belial" não queriam repartir; Davi decreta: "</w:t>
-      </w:r>
-      <w:r>
-        <w:rPr>
-          <w:rFonts w:ascii="Cambria" w:cs="Cambria" w:eastAsia="Cambria" w:hAnsi="Cambria"/>
-          <w:b/>
-          <w:bCs/>
-          <w:color w:val="2B2B33"/>
-          <w:sz w:val="23"/>
-          <w:szCs w:val="23"/>
-        </w:rPr>
-        <w:t xml:space="preserve">igualmente repartirão</w:t>
-      </w:r>
-      <w:r>
-        <w:rPr>
-          <w:rFonts w:ascii="Cambria" w:cs="Cambria" w:eastAsia="Cambria" w:hAnsi="Cambria"/>
-          <w:color w:val="2B2B33"/>
-          <w:sz w:val="23"/>
-          <w:szCs w:val="23"/>
-        </w:rPr>
-        <w:t xml:space="preserve">", e vira estatuto. O Filho de Davi vence sozinho na cruz e reparte o despojo.</w:t>
+        <w:t xml:space="preserve">: 200 exaustos com a bagagem; os "perversos e malignos" não queriam repartir; Davi, já ungido rei, mas ainda sem trono, decreta: "</w:t>
+      </w:r>
+      <w:r>
+        <w:rPr>
+          <w:rFonts w:ascii="Cambria" w:cs="Cambria" w:eastAsia="Cambria" w:hAnsi="Cambria"/>
+          <w:b/>
+          <w:bCs/>
+          <w:color w:val="2B2B33"/>
+          <w:sz w:val="23"/>
+          <w:szCs w:val="23"/>
+        </w:rPr>
+        <w:t xml:space="preserve">receberão partes iguais</w:t>
+      </w:r>
+      <w:r>
+        <w:rPr>
+          <w:rFonts w:ascii="Cambria" w:cs="Cambria" w:eastAsia="Cambria" w:hAnsi="Cambria"/>
+          <w:color w:val="2B2B33"/>
+          <w:sz w:val="23"/>
+          <w:szCs w:val="23"/>
+        </w:rPr>
+        <w:t xml:space="preserve">" (30.24), e vira estatuto. O Filho de Davi vence sozinho na cruz e reparte o despojo.</w:t>
       </w:r>
     </w:p>
     <w:p>
@@ -5210,7 +5250,7 @@
           <w:sz w:val="23"/>
           <w:szCs w:val="23"/>
         </w:rPr>
-        <w:t xml:space="preserve">Senhor, Filho de Davi, tem compaixão de nós!</w:t>
+        <w:t xml:space="preserve">Senhor, Filho de Davi, tenha compaixão de nós!</w:t>
       </w:r>
       <w:r>
         <w:rPr>
@@ -5250,7 +5290,7 @@
           <w:sz w:val="23"/>
           <w:szCs w:val="23"/>
         </w:rPr>
-        <w:t xml:space="preserve">Que quereis que eu vos faça?</w:t>
+        <w:t xml:space="preserve">O que vocês querem que eu lhes faça?</w:t>
       </w:r>
       <w:r>
         <w:rPr>
@@ -5290,16 +5330,16 @@
           <w:sz w:val="23"/>
           <w:szCs w:val="23"/>
         </w:rPr>
-        <w:t xml:space="preserve">que se nos abram os olhos</w:t>
-      </w:r>
-      <w:r>
-        <w:rPr>
-          <w:rFonts w:ascii="Cambria" w:cs="Cambria" w:eastAsia="Cambria" w:hAnsi="Cambria"/>
-          <w:color w:val="2B2B33"/>
-          <w:sz w:val="23"/>
-          <w:szCs w:val="23"/>
-        </w:rPr>
-        <w:t xml:space="preserve">";</w:t>
+        <w:t xml:space="preserve">Senhor, que se abram os nossos olhos</w:t>
+      </w:r>
+      <w:r>
+        <w:rPr>
+          <w:rFonts w:ascii="Cambria" w:cs="Cambria" w:eastAsia="Cambria" w:hAnsi="Cambria"/>
+          <w:color w:val="2B2B33"/>
+          <w:sz w:val="23"/>
+          <w:szCs w:val="23"/>
+        </w:rPr>
+        <w:t xml:space="preserve">" (20.33);</w:t>
       </w:r>
     </w:p>
     <w:p>
@@ -5319,7 +5359,7 @@
           <w:sz w:val="23"/>
           <w:szCs w:val="23"/>
         </w:rPr>
-        <w:t xml:space="preserve">"Condoído, Jesus tocou-lhes os olhos, e imediatamente recuperaram a vista e o foram seguindo" (20.34).</w:t>
+        <w:t xml:space="preserve">"Profundamente compadecido, Jesus tocou nos olhos deles. E imediatamente recuperaram a vista e o seguiram" (20.34).</w:t>
       </w:r>
     </w:p>
     <w:p>
@@ -5441,7 +5481,7 @@
           <w:sz w:val="23"/>
           <w:szCs w:val="23"/>
         </w:rPr>
-        <w:t xml:space="preserve"> ninguém pode cobrar e ninguém precisa competir. Não é um bolo que diminui quando outro come. Gn 15.1: "Eu sou o teu grandíssimo galardão". Não se divide por horas aquilo que é uma Pessoa.</w:t>
+        <w:t xml:space="preserve"> ninguém pode cobrar e ninguém precisa competir. Não é um bolo que diminui quando outro come. Gn 15.1: "eu sou o seu escudo" vem antes da recompensa; Sl 73.25-26: "Deus é [...] a minha herança para sempre". A recompensa é ele mesmo. Não se divide por horas aquilo que é uma Pessoa.</w:t>
       </w:r>
     </w:p>
     <w:p>
@@ -5836,7 +5876,7 @@
           <w:sz w:val="23"/>
           <w:szCs w:val="23"/>
         </w:rPr>
-        <w:t xml:space="preserve"> o ladrão, sem batismo, sem culto, sem um minuto de serviço, ouviu "hoje estarás comigo". "Ninguém me contratou" não é o fim; o Rei sai às 17h e paga o dia inteiro.</w:t>
+        <w:t xml:space="preserve"> o ladrão, sem batismo, sem culto, sem um minuto de serviço, ouviu "hoje você estará comigo no paraíso". "Ninguém me contratou" não é o fim; o Rei sai às 17h e paga o dia inteiro.</w:t>
       </w:r>
     </w:p>
     <w:p>
@@ -5950,7 +5990,7 @@
           <w:sz w:val="23"/>
           <w:szCs w:val="23"/>
         </w:rPr>
-        <w:t xml:space="preserve"> Judas, três anos e uma conta aberta ("Que me quereis dar?"); o ladrão, poucas horas e nenhuma conta ("Lembra-te de mim"). A diferença não foi o tempo de serviço; foi o que cada um quis e para onde olhou.</w:t>
+        <w:t xml:space="preserve"> Judas, três anos e uma conta aberta ("Quanto me darão?"); o ladrão, poucas horas e nenhuma conta ("Lembre-se de mim"). A diferença não foi o tempo de serviço; foi o que cada um quis e para onde olhou.</w:t>
       </w:r>
     </w:p>
     <w:p>
@@ -6012,7 +6052,7 @@
           <w:sz w:val="23"/>
           <w:szCs w:val="23"/>
         </w:rPr>
-        <w:t xml:space="preserve"> a oração dos cegos: "Senhor, Filho de Davi, tem compaixão de nós. Abre os nossos olhos."</w:t>
+        <w:t xml:space="preserve"> a oração dos cegos: "Senhor, Filho de Davi, tenha compaixão de nós. Que se abram os nossos olhos."</w:t>
       </w:r>
     </w:p>
     <w:p>
@@ -6373,7 +6413,7 @@
           <w:sz w:val="23"/>
           <w:szCs w:val="23"/>
         </w:rPr>
-        <w:t xml:space="preserve"> citados no texto em redação ARA; a leitura é NAA.</w:t>
+        <w:t xml:space="preserve"> leitura e citações na NAA. Ditos ao pé da letra, com aviso: Mt 20.15b ("o teu olho é mau") e Pv 22.9 ("o de olho bom").</w:t>
       </w:r>
     </w:p>
     <w:sectPr>

</xml_diff>